<commit_message>
Agregar enlaces de entrega al informe (video en Drive y repositorio)
Co-Authored-By: Claude Fable 5 <noreply@anthropic.com>
</commit_message>
<xml_diff>
--- a/Informe_Parcial.docx
+++ b/Informe_Parcial.docx
@@ -503,16 +503,84 @@
     </w:p>
     <w:p>
       <w:pPr>
+        <w:spacing w:after="60" w:line="232" w:lineRule="auto"/>
+      </w:pPr>
+      <w:r>
+        <w:rPr>
+          <w:rFonts w:ascii="Calibri" w:cs="Calibri" w:eastAsia="Calibri" w:hAnsi="Calibri"/>
+          <w:sz w:val="20"/>
+          <w:szCs w:val="20"/>
+        </w:rPr>
+        <w:t xml:space="preserve">WASD + ratón para moverse, clic izquierdo dispara, R recarga, Q cambia de arma. Hay 5 enemigos y 3 botiquines en el laberinto. Al eliminar a todos los enemigos, un aviso indica ir a la meta (pilar verde, esquina noreste); al tocarla suena la victoria y aparece el panel final. Si el jugador muere, aparece el menú de Game Over con Reintentar.</w:t>
+      </w:r>
+    </w:p>
+    <w:p>
+      <w:pPr>
+        <w:spacing w:after="60" w:before="160"/>
+      </w:pPr>
+      <w:r>
+        <w:rPr>
+          <w:rFonts w:ascii="Calibri" w:cs="Calibri" w:eastAsia="Calibri" w:hAnsi="Calibri"/>
+          <w:b/>
+          <w:bCs/>
+          <w:color w:val="8B1A1A"/>
+          <w:sz w:val="22"/>
+          <w:szCs w:val="22"/>
+        </w:rPr>
+        <w:t xml:space="preserve">5. Enlaces de entrega</w:t>
+      </w:r>
+    </w:p>
+    <w:p>
+      <w:pPr>
+        <w:spacing w:after="30" w:line="232" w:lineRule="auto"/>
+      </w:pPr>
+      <w:r>
+        <w:rPr>
+          <w:rFonts w:ascii="Calibri" w:cs="Calibri" w:eastAsia="Calibri" w:hAnsi="Calibri"/>
+          <w:b/>
+          <w:bCs/>
+          <w:sz w:val="20"/>
+          <w:szCs w:val="20"/>
+        </w:rPr>
+        <w:t xml:space="preserve">Video de demostración (Google Drive): </w:t>
+      </w:r>
+      <w:hyperlink w:history="1" r:id="rIdmbkfrcdrp9ch-erfpfng8">
+        <w:r>
+          <w:rPr>
+            <w:rStyle w:val="Hyperlink"/>
+            <w:rFonts w:ascii="Calibri" w:cs="Calibri" w:eastAsia="Calibri" w:hAnsi="Calibri"/>
+            <w:sz w:val="20"/>
+            <w:szCs w:val="20"/>
+          </w:rPr>
+          <w:t xml:space="preserve">drive.google.com/drive/folders/104kNrNPy8-r3GV2IACF7S9OsqknFrVXg</w:t>
+        </w:r>
+      </w:hyperlink>
+    </w:p>
+    <w:p>
+      <w:pPr>
         <w:spacing w:after="0" w:line="232" w:lineRule="auto"/>
       </w:pPr>
       <w:r>
         <w:rPr>
           <w:rFonts w:ascii="Calibri" w:cs="Calibri" w:eastAsia="Calibri" w:hAnsi="Calibri"/>
-          <w:sz w:val="20"/>
-          <w:szCs w:val="20"/>
-        </w:rPr>
-        <w:t xml:space="preserve">WASD + ratón para moverse, clic izquierdo dispara, R recarga, Q cambia de arma. Hay 5 enemigos y 3 botiquines en el laberinto. Al eliminar a todos los enemigos, un aviso indica ir a la meta (pilar verde, esquina noreste); al tocarla suena la victoria y aparece el panel final. Si el jugador muere, aparece el menú de Game Over con Reintentar.</w:t>
-      </w:r>
+          <w:b/>
+          <w:bCs/>
+          <w:sz w:val="20"/>
+          <w:szCs w:val="20"/>
+        </w:rPr>
+        <w:t xml:space="preserve">Proyecto completo (GitHub): </w:t>
+      </w:r>
+      <w:hyperlink w:history="1" r:id="rIduwkqsdyiltla2f7qcvyjn">
+        <w:r>
+          <w:rPr>
+            <w:rStyle w:val="Hyperlink"/>
+            <w:rFonts w:ascii="Calibri" w:cs="Calibri" w:eastAsia="Calibri" w:hAnsi="Calibri"/>
+            <w:sz w:val="20"/>
+            <w:szCs w:val="20"/>
+          </w:rPr>
+          <w:t xml:space="preserve">github.com/Joabits/Shooter3DDoom</w:t>
+        </w:r>
+      </w:hyperlink>
     </w:p>
     <w:sectPr>
       <w:pgSz w:w="12240" w:h="15840" w:orient="portrait"/>

</xml_diff>